<commit_message>
changed --- format to  ***
</commit_message>
<xml_diff>
--- a/journal/journal.docx
+++ b/journal/journal.docx
@@ -2,7 +2,7 @@
 <file path=word/document.xml><?xml version="1.0" encoding="utf-8"?>
 <w:document xmlns:w="http://schemas.openxmlformats.org/wordprocessingml/2006/main" xmlns:m="http://schemas.openxmlformats.org/officeDocument/2006/math" xmlns:r="http://schemas.openxmlformats.org/officeDocument/2006/relationships" xmlns:o="urn:schemas-microsoft-com:office:office" xmlns:v="urn:schemas-microsoft-com:vml" xmlns:w10="urn:schemas-microsoft-com:office:word" xmlns:a="http://schemas.openxmlformats.org/drawingml/2006/main" xmlns:pic="http://schemas.openxmlformats.org/drawingml/2006/picture" xmlns:wp="http://schemas.openxmlformats.org/drawingml/2006/wordprocessingDrawing">
   <w:body>
-    <w:bookmarkStart w:id="26" w:name="quantum-communications-internship-irida"/>
+    <w:bookmarkStart w:id="28" w:name="quantum-communications-internship-irida"/>
     <w:p>
       <w:pPr>
         <w:pStyle w:val="Heading1"/>
@@ -11,32 +11,23 @@
         <w:t xml:space="preserve">Quantum Communications Internship @ IRIDA</w:t>
       </w:r>
     </w:p>
-    <w:bookmarkStart w:id="25" w:name="week-1-july-1-8"/>
+    <w:bookmarkStart w:id="20" w:name="week-1-july-18"/>
     <w:p>
       <w:pPr>
         <w:pStyle w:val="Heading2"/>
       </w:pPr>
       <w:r>
-        <w:rPr>
-          <w:bCs/>
-          <w:b/>
-        </w:rPr>
-        <w:t xml:space="preserve">Week 1</w:t>
-      </w:r>
-      <w:r>
-        <w:t xml:space="preserve"> </w:t>
-      </w:r>
-      <w:r>
-        <w:t xml:space="preserve">(July 1-8)</w:t>
-      </w:r>
-    </w:p>
-    <w:bookmarkStart w:id="20" w:name="milestones"/>
-    <w:p>
-      <w:pPr>
-        <w:pStyle w:val="Heading3"/>
-      </w:pPr>
-      <w:r>
-        <w:t xml:space="preserve">Milestones:</w:t>
+        <w:t xml:space="preserve">Week 1 (July 1–8)</w:t>
+      </w:r>
+    </w:p>
+    <w:bookmarkEnd w:id="20"/>
+    <w:bookmarkStart w:id="21" w:name="milestones"/>
+    <w:p>
+      <w:pPr>
+        <w:pStyle w:val="Heading2"/>
+      </w:pPr>
+      <w:r>
+        <w:t xml:space="preserve">Milestones</w:t>
       </w:r>
     </w:p>
     <w:p>
@@ -50,6 +41,9 @@
       <w:r>
         <w:t xml:space="preserve">Define Objectives/Plan for project</w:t>
       </w:r>
+      <w:r>
+        <w:br/>
+      </w:r>
     </w:p>
     <w:p>
       <w:pPr>
@@ -60,7 +54,10 @@
         <w:pStyle w:val="Compact"/>
       </w:pPr>
       <w:r>
-        <w:t xml:space="preserve">Read reference paper &amp; Study theoretical background (homodyne detection, squeezed/coherent states, Helstrom bound)</w:t>
+        <w:t xml:space="preserve">Read reference paper &amp; study theoretical background (homodyne detection, squeezed/coherent states, Helstrom bound)</w:t>
+      </w:r>
+      <w:r>
+        <w:br/>
       </w:r>
     </w:p>
     <w:p>
@@ -74,6 +71,9 @@
       <w:r>
         <w:t xml:space="preserve">Familiarize with Strawberry Fields (SF) software</w:t>
       </w:r>
+      <w:r>
+        <w:br/>
+      </w:r>
     </w:p>
     <w:p>
       <w:pPr>
@@ -86,6 +86,9 @@
       <w:r>
         <w:t xml:space="preserve">Prepare helper functions for state visualisation and measurement in SF</w:t>
       </w:r>
+      <w:r>
+        <w:br/>
+      </w:r>
     </w:p>
     <w:p>
       <w:pPr>
@@ -98,6 +101,9 @@
       <w:r>
         <w:t xml:space="preserve">Prepare protocols for coherent functions and displaced squeezed functions in noise-free channel</w:t>
       </w:r>
+      <w:r>
+        <w:br/>
+      </w:r>
     </w:p>
     <w:p>
       <w:pPr>
@@ -110,25 +116,30 @@
       <w:r>
         <w:t xml:space="preserve">Visualise the error probability for the aforementioned protocols and compare to theoretical function</w:t>
       </w:r>
-    </w:p>
-    <w:bookmarkEnd w:id="20"/>
-    <w:bookmarkStart w:id="21" w:name="progress"/>
+      <w:r>
+        <w:t xml:space="preserve"> </w:t>
+      </w:r>
+      <w:r>
+        <w:t xml:space="preserve">***</w:t>
+      </w:r>
+    </w:p>
+    <w:bookmarkEnd w:id="21"/>
+    <w:bookmarkStart w:id="27" w:name="progress"/>
+    <w:p>
+      <w:pPr>
+        <w:pStyle w:val="Heading2"/>
+      </w:pPr>
+      <w:r>
+        <w:t xml:space="preserve">Progress</w:t>
+      </w:r>
+    </w:p>
+    <w:bookmarkStart w:id="23" w:name="define-objectives-for-project"/>
     <w:p>
       <w:pPr>
         <w:pStyle w:val="Heading3"/>
       </w:pPr>
       <w:r>
-        <w:t xml:space="preserve">Progress</w:t>
-      </w:r>
-    </w:p>
-    <w:bookmarkEnd w:id="21"/>
-    <w:bookmarkStart w:id="23" w:name="define-objectives-for-project"/>
-    <w:p>
-      <w:pPr>
-        <w:pStyle w:val="Heading3"/>
-      </w:pPr>
-      <w:r>
-        <w:t xml:space="preserve">- Define Objectives for project</w:t>
+        <w:t xml:space="preserve">Define Objectives for Project</w:t>
       </w:r>
     </w:p>
     <w:p>
@@ -199,25 +210,25 @@
         <w:t xml:space="preserve"> </w:t>
       </w:r>
       <w:r>
-        <w:t xml:space="preserve">- Understand the principles of PSK binary communication.</w:t>
-      </w:r>
-      <w:r>
-        <w:t xml:space="preserve"> </w:t>
-      </w:r>
-      <w:r>
-        <w:t xml:space="preserve">- Investigate the effect of squeezing on quadrature statistics and state discrimination.</w:t>
-      </w:r>
-      <w:r>
-        <w:t xml:space="preserve"> </w:t>
-      </w:r>
-      <w:r>
-        <w:t xml:space="preserve">- Analyse the effect of channel imperfections on the communication performance.</w:t>
-      </w:r>
-      <w:r>
-        <w:t xml:space="preserve"> </w:t>
-      </w:r>
-      <w:r>
-        <w:t xml:space="preserve">- Study Helstrom bound and compare with homodyne-based detection.</w:t>
+        <w:t xml:space="preserve">- Understand the principles of PSK binary communication</w:t>
+      </w:r>
+      <w:r>
+        <w:br/>
+      </w:r>
+      <w:r>
+        <w:t xml:space="preserve">- Investigate the effect of squeezing on quadrature statistics and state discrimination</w:t>
+      </w:r>
+      <w:r>
+        <w:br/>
+      </w:r>
+      <w:r>
+        <w:t xml:space="preserve">- Analyse the effect of channel imperfections on the communication performance</w:t>
+      </w:r>
+      <w:r>
+        <w:br/>
+      </w:r>
+      <w:r>
+        <w:t xml:space="preserve">- Study Helstrom bound and compare with homodyne-based detection</w:t>
       </w:r>
     </w:p>
     <w:p>
@@ -235,25 +246,32 @@
         <w:t xml:space="preserve"> </w:t>
       </w:r>
       <w:r>
-        <w:t xml:space="preserve">- Become proficient in the Strawberry Fields quantum photonic simulation framework.</w:t>
-      </w:r>
-      <w:r>
-        <w:t xml:space="preserve"> </w:t>
-      </w:r>
-      <w:r>
-        <w:t xml:space="preserve">- Simulate Gaussian states in various channels and perform homodyne detection.</w:t>
-      </w:r>
-      <w:r>
-        <w:t xml:space="preserve"> </w:t>
-      </w:r>
-      <w:r>
-        <w:t xml:space="preserve">- Investigate the influence of key system parameters (e.g. squeezing) on performance.</w:t>
-      </w:r>
-      <w:r>
-        <w:t xml:space="preserve"> </w:t>
-      </w:r>
-      <w:r>
-        <w:t xml:space="preserve">- Validate the simulated results against the theoretical predictions of the paper.</w:t>
+        <w:t xml:space="preserve">- Become proficient in the Strawberry Fields quantum photonic simulation framework</w:t>
+      </w:r>
+      <w:r>
+        <w:br/>
+      </w:r>
+      <w:r>
+        <w:t xml:space="preserve">- Simulate Gaussian states in various channels and perform homodyne detection</w:t>
+      </w:r>
+      <w:r>
+        <w:br/>
+      </w:r>
+      <w:r>
+        <w:t xml:space="preserve">- Investigate the influence of key system parameters (e.g. squeezing) on performance</w:t>
+      </w:r>
+      <w:r>
+        <w:br/>
+      </w:r>
+      <w:r>
+        <w:t xml:space="preserve">- Validate the simulated results against the theoretical predictions of the paper</w:t>
+      </w:r>
+    </w:p>
+    <w:p>
+      <w:r>
+        <w:pict>
+          <v:rect style="width:0;height:1.5pt" o:hralign="center" o:hrstd="t" o:hr="t"/>
+        </w:pict>
       </w:r>
     </w:p>
     <w:bookmarkEnd w:id="23"/>
@@ -263,7 +281,7 @@
         <w:pStyle w:val="Heading3"/>
       </w:pPr>
       <w:r>
-        <w:t xml:space="preserve">- Plan to Achieve the Objectives</w:t>
+        <w:t xml:space="preserve">Plan to Achieve the Objectives</w:t>
       </w:r>
     </w:p>
     <w:p>
@@ -273,70 +291,464 @@
       <w:r>
         <w:t xml:space="preserve">The theoretical and computational objectives will be developed in parallel so that the understanding of the underlying physics continuously informs the implementation, while simulation results provide numerical validation of the theoretical predictions.</w:t>
       </w:r>
+    </w:p>
+    <w:p>
+      <w:pPr>
+        <w:numPr>
+          <w:ilvl w:val="0"/>
+          <w:numId w:val="1002"/>
+        </w:numPr>
+      </w:pPr>
+      <w:r>
+        <w:t xml:space="preserve">Familiarization with Strawberry Fields</w:t>
+      </w:r>
+      <w:r>
+        <w:br/>
+      </w:r>
+      <w:r>
+        <w:t xml:space="preserve">Develop an intuitive understanding on how the Strawberry Fields framework works by studying its capabilities (e.g. state and channel preparation, measurement operations).</w:t>
+      </w:r>
+    </w:p>
+    <w:p>
+      <w:pPr>
+        <w:numPr>
+          <w:ilvl w:val="0"/>
+          <w:numId w:val="1002"/>
+        </w:numPr>
+      </w:pPr>
+      <w:r>
+        <w:t xml:space="preserve">Development and Validation of Core Simulation Components</w:t>
+      </w:r>
+      <w:r>
+        <w:br/>
+      </w:r>
+      <w:r>
+        <w:t xml:space="preserve">Implement a collection of helper functions performing specific tasks and validate them independently against theoretical results before integrating it into the complete protocol.</w:t>
+      </w:r>
+    </w:p>
+    <w:p>
+      <w:pPr>
+        <w:numPr>
+          <w:ilvl w:val="0"/>
+          <w:numId w:val="1002"/>
+        </w:numPr>
+      </w:pPr>
+      <w:r>
+        <w:t xml:space="preserve">Progressive Construction of the Communication Model</w:t>
+      </w:r>
+      <w:r>
+        <w:br/>
+      </w:r>
+      <w:r>
+        <w:t xml:space="preserve">Combine the validated components to build a variety of communication scenarios. This approach facilitates debugging, validation, and future extensions of the simulation.</w:t>
+      </w:r>
+    </w:p>
+    <w:p>
+      <w:pPr>
+        <w:numPr>
+          <w:ilvl w:val="0"/>
+          <w:numId w:val="1002"/>
+        </w:numPr>
+      </w:pPr>
+      <w:r>
+        <w:t xml:space="preserve">Performance Evaluation and Comparison</w:t>
+      </w:r>
+      <w:r>
+        <w:br/>
+      </w:r>
+      <w:r>
+        <w:t xml:space="preserve">Compare error probabilities with the Helstrom bound to assess the potential advantages of squeezing-enhanced communication under different conditions.</w:t>
+      </w:r>
+    </w:p>
+    <w:p>
+      <w:pPr>
+        <w:numPr>
+          <w:ilvl w:val="0"/>
+          <w:numId w:val="1002"/>
+        </w:numPr>
+      </w:pPr>
+      <w:r>
+        <w:t xml:space="preserve">Theoretical Analysis and Verification</w:t>
+      </w:r>
+      <w:r>
+        <w:br/>
+      </w:r>
+      <w:r>
+        <w:t xml:space="preserve">Derive the analytical expressions relevant to the project and compare simulated results with the analytical predictions of the reference paper.</w:t>
+      </w:r>
+    </w:p>
+    <w:p>
+      <w:r>
+        <w:pict>
+          <v:rect style="width:0;height:1.5pt" o:hralign="center" o:hrstd="t" o:hr="t"/>
+        </w:pict>
+      </w:r>
+    </w:p>
+    <w:bookmarkEnd w:id="24"/>
+    <w:bookmarkStart w:id="25" w:name="Xeaf8f965c2875702ad33a77796308e2f862840d"/>
+    <w:p>
+      <w:pPr>
+        <w:pStyle w:val="Heading3"/>
+      </w:pPr>
+      <w:r>
+        <w:t xml:space="preserve">Prepare helper functions for state visualisation and measurement in SF</w:t>
+      </w:r>
+    </w:p>
+    <w:p>
+      <w:pPr>
+        <w:pStyle w:val="FirstParagraph"/>
+      </w:pPr>
+      <w:r>
+        <w:rPr>
+          <w:bCs/>
+          <w:b/>
+        </w:rPr>
+        <w:t xml:space="preserve">State Visualisation:</w:t>
+      </w:r>
       <w:r>
         <w:t xml:space="preserve"> </w:t>
       </w:r>
       <w:r>
-        <w:t xml:space="preserve">- Familiarization with Strawberry Fields</w:t>
+        <w:t xml:space="preserve">Created functions that can visualise the Wigner function of a coherent state, squeezed-vacuum or displaced-squeezed vacuum according to user’s inputs. The output is just a plot.</w:t>
+      </w:r>
+    </w:p>
+    <w:p>
+      <w:pPr>
+        <w:pStyle w:val="BodyText"/>
+      </w:pPr>
+      <w:r>
+        <w:rPr>
+          <w:bCs/>
+          <w:b/>
+        </w:rPr>
+        <w:t xml:space="preserve">State Measurement:</w:t>
       </w:r>
       <w:r>
         <w:t xml:space="preserve"> </w:t>
       </w:r>
       <w:r>
-        <w:t xml:space="preserve">Develop an intuitive understanding on how the Strawberry Fields framework works by studying its capabilities (e.g. state and channel preparation, measurement operations).</w:t>
+        <w:t xml:space="preserve">Created functions that can perform homodyne detection for a coherent state, squeezed-vacuum or displaced-squeezed vaccum according to user’s inputs. The output is a single measurement following the statistics of the state.</w:t>
+      </w:r>
+    </w:p>
+    <w:p>
+      <w:r>
+        <w:pict>
+          <v:rect style="width:0;height:1.5pt" o:hralign="center" o:hrstd="t" o:hr="t"/>
+        </w:pict>
+      </w:r>
+    </w:p>
+    <w:bookmarkEnd w:id="25"/>
+    <w:bookmarkStart w:id="26" w:name="X673e1914546ef077eeaa8e60a912210bac6e183"/>
+    <w:p>
+      <w:pPr>
+        <w:pStyle w:val="Heading3"/>
+      </w:pPr>
+      <w:r>
+        <w:t xml:space="preserve">Prepare protocols for coherent functions and displaced squeezed functions in noise-free channel</w:t>
+      </w:r>
+    </w:p>
+    <w:p>
+      <w:pPr>
+        <w:pStyle w:val="FirstParagraph"/>
+      </w:pPr>
+      <w:r>
+        <w:t xml:space="preserve">Homodyne measurements are performed for the exchange of coherent states, which are either prepared as</w:t>
       </w:r>
       <w:r>
         <w:t xml:space="preserve"> </w:t>
       </w:r>
-      <w:r>
-        <w:t xml:space="preserve">- Development and Validation of Core Simulation Components</w:t>
-      </w:r>
+      <m:oMath>
+        <m:r>
+          <m:rPr>
+            <m:sty m:val="p"/>
+          </m:rPr>
+          <m:t>|</m:t>
+        </m:r>
+        <m:r>
+          <m:t>α</m:t>
+        </m:r>
+        <m:r>
+          <m:rPr>
+            <m:sty m:val="p"/>
+          </m:rPr>
+          <m:t>⟩</m:t>
+        </m:r>
+      </m:oMath>
       <w:r>
         <w:t xml:space="preserve"> </w:t>
       </w:r>
       <w:r>
-        <w:t xml:space="preserve">Implement a collection of helper functions performing specific tasks and validate them independently against theoretical results before integrating it into the complete protocol.</w:t>
+        <w:t xml:space="preserve">or</w:t>
       </w:r>
       <w:r>
         <w:t xml:space="preserve"> </w:t>
       </w:r>
-      <w:r>
-        <w:t xml:space="preserve">- Progressive Construction of the Communication Model</w:t>
-      </w:r>
+      <m:oMath>
+        <m:r>
+          <m:rPr>
+            <m:sty m:val="p"/>
+          </m:rPr>
+          <m:t>|</m:t>
+        </m:r>
+        <m:r>
+          <m:rPr>
+            <m:sty m:val="p"/>
+          </m:rPr>
+          <m:t>−</m:t>
+        </m:r>
+        <m:r>
+          <m:t>α</m:t>
+        </m:r>
+        <m:r>
+          <m:rPr>
+            <m:sty m:val="p"/>
+          </m:rPr>
+          <m:t>⟩</m:t>
+        </m:r>
+      </m:oMath>
       <w:r>
         <w:t xml:space="preserve"> </w:t>
       </w:r>
       <w:r>
-        <w:t xml:space="preserve">Combine the validated components to build a variety of communication scenarios. This approach facilitates debugging, validation, and future extensions of the simulation.</w:t>
+        <w:t xml:space="preserve">with equal probability. For each value of</w:t>
       </w:r>
       <w:r>
         <w:t xml:space="preserve"> </w:t>
       </w:r>
-      <w:r>
-        <w:t xml:space="preserve">- Performance Evaluation and Comparison</w:t>
+      <m:oMath>
+        <m:r>
+          <m:t>α</m:t>
+        </m:r>
+      </m:oMath>
+      <w:r>
+        <w:t xml:space="preserve">, the measurement process is sampled many times, and the number of incorrectly classified states is recorded to estimate the error probability. This procedure is repeated over a range of values of</w:t>
       </w:r>
       <w:r>
         <w:t xml:space="preserve"> </w:t>
       </w:r>
-      <w:r>
-        <w:t xml:space="preserve">Compare error probabilities with the Helstrom bound to assess the potential advantages of squeezing-enhanced communication under different conditions.</w:t>
-      </w:r>
+      <m:oMath>
+        <m:r>
+          <m:t>α</m:t>
+        </m:r>
+      </m:oMath>
       <w:r>
         <w:t xml:space="preserve"> </w:t>
       </w:r>
       <w:r>
-        <w:t xml:space="preserve">- Theoretical Analysis and Verification</w:t>
-      </w:r>
-      <w:r>
-        <w:t xml:space="preserve"> </w:t>
-      </w:r>
-      <w:r>
-        <w:t xml:space="preserve">Derive the analytical expressions relevant to the project and compare simulated results with the analytical predictions of the reference paper.</w:t>
-      </w:r>
-    </w:p>
-    <w:bookmarkEnd w:id="24"/>
-    <w:bookmarkEnd w:id="25"/>
+        <w:t xml:space="preserve">to investigate the behaviour of the error probability as a function of the average photon number.</w:t>
+      </w:r>
+    </w:p>
+    <w:p>
+      <w:pPr>
+        <w:pStyle w:val="BodyText"/>
+      </w:pPr>
+      <w:r>
+        <w:t xml:space="preserve">The same protocol is then extended to displaced squeezed states. In this case, the total energy is kept fixed while a fraction of the energy is allocated to squeezing. The error probability is studied as a function of the total photon number,</w:t>
+      </w:r>
+    </w:p>
+    <w:p>
+      <w:pPr>
+        <w:pStyle w:val="BodyText"/>
+      </w:pPr>
+      <m:oMathPara>
+        <m:oMathParaPr>
+          <m:jc m:val="center"/>
+        </m:oMathParaPr>
+        <m:oMath>
+          <m:sSub>
+            <m:e>
+              <m:r>
+                <m:t>N</m:t>
+              </m:r>
+            </m:e>
+            <m:sub>
+              <m:r>
+                <m:rPr>
+                  <m:sty m:val="p"/>
+                </m:rPr>
+                <m:t>t</m:t>
+              </m:r>
+              <m:r>
+                <m:rPr>
+                  <m:sty m:val="p"/>
+                </m:rPr>
+                <m:t>o</m:t>
+              </m:r>
+              <m:r>
+                <m:rPr>
+                  <m:sty m:val="p"/>
+                </m:rPr>
+                <m:t>t</m:t>
+              </m:r>
+            </m:sub>
+          </m:sSub>
+          <m:r>
+            <m:rPr>
+              <m:sty m:val="p"/>
+            </m:rPr>
+            <m:t>=</m:t>
+          </m:r>
+          <m:sSup>
+            <m:e>
+              <m:d>
+                <m:dPr>
+                  <m:begChr m:val="|"/>
+                  <m:endChr m:val="|"/>
+                  <m:sepChr m:val=""/>
+                  <m:grow/>
+                </m:dPr>
+                <m:e>
+                  <m:r>
+                    <m:t>α</m:t>
+                  </m:r>
+                </m:e>
+              </m:d>
+            </m:e>
+            <m:sup>
+              <m:r>
+                <m:t>2</m:t>
+              </m:r>
+            </m:sup>
+          </m:sSup>
+          <m:r>
+            <m:rPr>
+              <m:sty m:val="p"/>
+            </m:rPr>
+            <m:t>+</m:t>
+          </m:r>
+          <m:sSup>
+            <m:e>
+              <m:r>
+                <m:rPr>
+                  <m:sty m:val="p"/>
+                </m:rPr>
+                <m:t>sinh</m:t>
+              </m:r>
+            </m:e>
+            <m:sup>
+              <m:r>
+                <m:t>2</m:t>
+              </m:r>
+            </m:sup>
+          </m:sSup>
+          <m:d>
+            <m:dPr>
+              <m:begChr m:val="("/>
+              <m:endChr m:val=")"/>
+              <m:sepChr m:val=""/>
+              <m:grow/>
+            </m:dPr>
+            <m:e>
+              <m:r>
+                <m:t>r</m:t>
+              </m:r>
+            </m:e>
+          </m:d>
+        </m:oMath>
+      </m:oMathPara>
+    </w:p>
+    <w:p>
+      <w:pPr>
+        <w:pStyle w:val="FirstParagraph"/>
+      </w:pPr>
+      <w:r>
+        <w:t xml:space="preserve">and the squeezing fraction,</w:t>
+      </w:r>
+    </w:p>
+    <w:p>
+      <w:pPr>
+        <w:pStyle w:val="BodyText"/>
+      </w:pPr>
+      <m:oMathPara>
+        <m:oMathParaPr>
+          <m:jc m:val="center"/>
+        </m:oMathParaPr>
+        <m:oMath>
+          <m:r>
+            <m:t>β</m:t>
+          </m:r>
+          <m:r>
+            <m:rPr>
+              <m:sty m:val="p"/>
+            </m:rPr>
+            <m:t>=</m:t>
+          </m:r>
+          <m:f>
+            <m:fPr>
+              <m:type m:val="bar"/>
+            </m:fPr>
+            <m:num>
+              <m:sSup>
+                <m:e>
+                  <m:r>
+                    <m:rPr>
+                      <m:sty m:val="p"/>
+                    </m:rPr>
+                    <m:t>sinh</m:t>
+                  </m:r>
+                </m:e>
+                <m:sup>
+                  <m:r>
+                    <m:t>2</m:t>
+                  </m:r>
+                </m:sup>
+              </m:sSup>
+              <m:d>
+                <m:dPr>
+                  <m:begChr m:val="("/>
+                  <m:endChr m:val=")"/>
+                  <m:sepChr m:val=""/>
+                  <m:grow/>
+                </m:dPr>
+                <m:e>
+                  <m:r>
+                    <m:t>r</m:t>
+                  </m:r>
+                </m:e>
+              </m:d>
+            </m:num>
+            <m:den>
+              <m:sSub>
+                <m:e>
+                  <m:r>
+                    <m:t>N</m:t>
+                  </m:r>
+                </m:e>
+                <m:sub>
+                  <m:r>
+                    <m:rPr>
+                      <m:sty m:val="p"/>
+                    </m:rPr>
+                    <m:t>t</m:t>
+                  </m:r>
+                  <m:r>
+                    <m:rPr>
+                      <m:sty m:val="p"/>
+                    </m:rPr>
+                    <m:t>o</m:t>
+                  </m:r>
+                  <m:r>
+                    <m:rPr>
+                      <m:sty m:val="p"/>
+                    </m:rPr>
+                    <m:t>t</m:t>
+                  </m:r>
+                </m:sub>
+              </m:sSub>
+            </m:den>
+          </m:f>
+          <m:r>
+            <m:rPr>
+              <m:sty m:val="p"/>
+            </m:rPr>
+            <m:t>.</m:t>
+          </m:r>
+        </m:oMath>
+      </m:oMathPara>
+    </w:p>
     <w:bookmarkEnd w:id="26"/>
+    <w:bookmarkEnd w:id="27"/>
+    <w:bookmarkEnd w:id="28"/>
     <w:sectPr/>
   </w:body>
 </w:document>
@@ -523,6 +935,9 @@
     <w:abstractNumId w:val="990"/>
   </w:num>
   <w:num w:numId="1001">
+    <w:abstractNumId w:val="991"/>
+  </w:num>
+  <w:num w:numId="1002">
     <w:abstractNumId w:val="991"/>
   </w:num>
 </w:numbering>

</xml_diff>

<commit_message>
made journal less dense
</commit_message>
<xml_diff>
--- a/journal/journal.docx
+++ b/journal/journal.docx
@@ -2,7 +2,7 @@
 <file path=word/document.xml><?xml version="1.0" encoding="utf-8"?>
 <w:document xmlns:w="http://schemas.openxmlformats.org/wordprocessingml/2006/main" xmlns:m="http://schemas.openxmlformats.org/officeDocument/2006/math" xmlns:r="http://schemas.openxmlformats.org/officeDocument/2006/relationships" xmlns:o="urn:schemas-microsoft-com:office:office" xmlns:v="urn:schemas-microsoft-com:vml" xmlns:w10="urn:schemas-microsoft-com:office:word" xmlns:a="http://schemas.openxmlformats.org/drawingml/2006/main" xmlns:pic="http://schemas.openxmlformats.org/drawingml/2006/picture" xmlns:wp="http://schemas.openxmlformats.org/drawingml/2006/wordprocessingDrawing">
   <w:body>
-    <w:bookmarkStart w:id="28" w:name="quantum-communications-internship-irida"/>
+    <w:bookmarkStart w:id="27" w:name="quantum-communications-internship-irida"/>
     <w:p>
       <w:pPr>
         <w:pStyle w:val="Heading1"/>
@@ -11,164 +11,42 @@
         <w:t xml:space="preserve">Quantum Communications Internship @ IRIDA</w:t>
       </w:r>
     </w:p>
-    <w:bookmarkStart w:id="20" w:name="week-1-july-18"/>
+    <w:bookmarkStart w:id="21" w:name="project-overview"/>
     <w:p>
       <w:pPr>
         <w:pStyle w:val="Heading2"/>
       </w:pPr>
       <w:r>
-        <w:t xml:space="preserve">Week 1 (July 1–8)</w:t>
-      </w:r>
-    </w:p>
-    <w:bookmarkEnd w:id="20"/>
-    <w:bookmarkStart w:id="21" w:name="milestones"/>
-    <w:p>
-      <w:pPr>
-        <w:pStyle w:val="Heading2"/>
-      </w:pPr>
-      <w:r>
-        <w:t xml:space="preserve">Milestones</w:t>
-      </w:r>
-    </w:p>
-    <w:p>
-      <w:pPr>
-        <w:numPr>
-          <w:ilvl w:val="0"/>
-          <w:numId w:val="1001"/>
-        </w:numPr>
-        <w:pStyle w:val="Compact"/>
-      </w:pPr>
-      <w:r>
-        <w:t xml:space="preserve">Define Objectives/Plan for project</w:t>
-      </w:r>
-      <w:r>
-        <w:br/>
-      </w:r>
-    </w:p>
-    <w:p>
-      <w:pPr>
-        <w:numPr>
-          <w:ilvl w:val="0"/>
-          <w:numId w:val="1001"/>
-        </w:numPr>
-        <w:pStyle w:val="Compact"/>
-      </w:pPr>
-      <w:r>
-        <w:t xml:space="preserve">Read reference paper &amp; study theoretical background (homodyne detection, squeezed/coherent states, Helstrom bound)</w:t>
-      </w:r>
-      <w:r>
-        <w:br/>
-      </w:r>
-    </w:p>
-    <w:p>
-      <w:pPr>
-        <w:numPr>
-          <w:ilvl w:val="0"/>
-          <w:numId w:val="1001"/>
-        </w:numPr>
-        <w:pStyle w:val="Compact"/>
-      </w:pPr>
-      <w:r>
-        <w:t xml:space="preserve">Familiarize with Strawberry Fields (SF) software</w:t>
-      </w:r>
-      <w:r>
-        <w:br/>
-      </w:r>
-    </w:p>
-    <w:p>
-      <w:pPr>
-        <w:numPr>
-          <w:ilvl w:val="0"/>
-          <w:numId w:val="1001"/>
-        </w:numPr>
-        <w:pStyle w:val="Compact"/>
-      </w:pPr>
-      <w:r>
-        <w:t xml:space="preserve">Prepare helper functions for state visualisation and measurement in SF</w:t>
-      </w:r>
-      <w:r>
-        <w:br/>
-      </w:r>
-    </w:p>
-    <w:p>
-      <w:pPr>
-        <w:numPr>
-          <w:ilvl w:val="0"/>
-          <w:numId w:val="1001"/>
-        </w:numPr>
-        <w:pStyle w:val="Compact"/>
-      </w:pPr>
-      <w:r>
-        <w:t xml:space="preserve">Prepare protocols for coherent functions and displaced squeezed functions in noise-free channel</w:t>
-      </w:r>
-      <w:r>
-        <w:br/>
-      </w:r>
-    </w:p>
-    <w:p>
-      <w:pPr>
-        <w:numPr>
-          <w:ilvl w:val="0"/>
-          <w:numId w:val="1001"/>
-        </w:numPr>
-        <w:pStyle w:val="Compact"/>
-      </w:pPr>
-      <w:r>
-        <w:t xml:space="preserve">Visualise the error probability for the aforementioned protocols and compare to theoretical function</w:t>
+        <w:t xml:space="preserve">Project Overview</w:t>
+      </w:r>
+    </w:p>
+    <w:p>
+      <w:pPr>
+        <w:pStyle w:val="FirstParagraph"/>
+      </w:pPr>
+      <w:r>
+        <w:t xml:space="preserve">The main goal of this project is to investigate whether quantum properties, such as squeezing, can improve realistic communication channels based on coherent optical states.</w:t>
+      </w:r>
+    </w:p>
+    <w:p>
+      <w:pPr>
+        <w:pStyle w:val="BodyText"/>
+      </w:pPr>
+      <w:r>
+        <w:t xml:space="preserve">We will study the phase-shift-keyed (PSK) binary communication protocol, where information is encoded and transmitted in coherent optical states and retrieved at the receiver using homodyne detection. Our aim is to determine whether the introduction of squeezing can improve the discrimination between the transmitted states and identify the optimal level of squeezing which minimizes the error probability. We will carry out this investigation both in ideal (noise-free) and realistic (noisy) channels. Our results will be directly compared with the ultimate quantum limits to discrimination, namely the Helstrom bound.</w:t>
+      </w:r>
+    </w:p>
+    <w:p>
+      <w:pPr>
+        <w:pStyle w:val="BodyText"/>
+      </w:pPr>
+      <w:r>
+        <w:t xml:space="preserve">In this project we will follow closely the research paper</w:t>
       </w:r>
       <w:r>
         <w:t xml:space="preserve"> </w:t>
       </w:r>
-      <w:r>
-        <w:t xml:space="preserve">***</w:t>
-      </w:r>
-    </w:p>
-    <w:bookmarkEnd w:id="21"/>
-    <w:bookmarkStart w:id="27" w:name="progress"/>
-    <w:p>
-      <w:pPr>
-        <w:pStyle w:val="Heading2"/>
-      </w:pPr>
-      <w:r>
-        <w:t xml:space="preserve">Progress</w:t>
-      </w:r>
-    </w:p>
-    <w:bookmarkStart w:id="23" w:name="define-objectives-for-project"/>
-    <w:p>
-      <w:pPr>
-        <w:pStyle w:val="Heading3"/>
-      </w:pPr>
-      <w:r>
-        <w:t xml:space="preserve">Define Objectives for Project</w:t>
-      </w:r>
-    </w:p>
-    <w:p>
-      <w:pPr>
-        <w:pStyle w:val="FirstParagraph"/>
-      </w:pPr>
-      <w:r>
-        <w:t xml:space="preserve">The main goal of this project is to investigate whether quantum properties, such as squeezing, can improve realistic communication channels based on coherent optical states.</w:t>
-      </w:r>
-    </w:p>
-    <w:p>
-      <w:pPr>
-        <w:pStyle w:val="BodyText"/>
-      </w:pPr>
-      <w:r>
-        <w:t xml:space="preserve">We will study the phase-shift-keyed (PSK) binary communication protocol, where information is encoded and transmitted in coherent optical states and retrieved at the receiver using homodyne detection. Our aim is to determine whether the introduction of squeezing can improve the discrimination between the transmitted states and identify the optimal level of squeezing which minimizes the error probability. We will carry out this investigation both in ideal (noise-free) and realistic (noisy) channels. Our results will be directly compared with the ultimate quantum limits to discrimination, namely the Helstrom bound.</w:t>
-      </w:r>
-    </w:p>
-    <w:p>
-      <w:pPr>
-        <w:pStyle w:val="BodyText"/>
-      </w:pPr>
-      <w:r>
-        <w:t xml:space="preserve">In this project we will follow closely the research paper</w:t>
-      </w:r>
-      <w:r>
-        <w:t xml:space="preserve"> </w:t>
-      </w:r>
-      <w:hyperlink r:id="rId22">
+      <w:hyperlink r:id="rId20">
         <w:r>
           <w:rPr>
             <w:rStyle w:val="Hyperlink"/>
@@ -195,76 +73,96 @@
         <w:t xml:space="preserve">and try to reproduce their analytical results using the Strawberry Fields quantum photonic simulation framework. This implementation will provide an independent numerical validation of the reported results and enable systematic exploration of the protocol under different settings.</w:t>
       </w:r>
     </w:p>
-    <w:p>
-      <w:pPr>
-        <w:pStyle w:val="BodyText"/>
-      </w:pPr>
-      <w:r>
-        <w:rPr>
-          <w:bCs/>
-          <w:b/>
-        </w:rPr>
-        <w:t xml:space="preserve">Theoretical Objectives</w:t>
-      </w:r>
-      <w:r>
-        <w:t xml:space="preserve"> </w:t>
-      </w:r>
-      <w:r>
-        <w:t xml:space="preserve">- Understand the principles of PSK binary communication</w:t>
+    <w:bookmarkEnd w:id="21"/>
+    <w:bookmarkStart w:id="22" w:name="week-1-july-18"/>
+    <w:p>
+      <w:pPr>
+        <w:pStyle w:val="Heading2"/>
+      </w:pPr>
+      <w:r>
+        <w:t xml:space="preserve">Week 1 (July 1–8)</w:t>
+      </w:r>
+    </w:p>
+    <w:bookmarkEnd w:id="22"/>
+    <w:bookmarkStart w:id="23" w:name="overview"/>
+    <w:p>
+      <w:pPr>
+        <w:pStyle w:val="Heading2"/>
+      </w:pPr>
+      <w:r>
+        <w:t xml:space="preserve">Overview</w:t>
+      </w:r>
+    </w:p>
+    <w:p>
+      <w:pPr>
+        <w:numPr>
+          <w:ilvl w:val="0"/>
+          <w:numId w:val="1001"/>
+        </w:numPr>
+        <w:pStyle w:val="Compact"/>
+      </w:pPr>
+      <w:r>
+        <w:t xml:space="preserve">Read reference paper &amp; studied theoretical background (homodyne detection, squeezed/coherent states, Helstrom bound)</w:t>
       </w:r>
       <w:r>
         <w:br/>
       </w:r>
-      <w:r>
-        <w:t xml:space="preserve">- Investigate the effect of squeezing on quadrature statistics and state discrimination</w:t>
+    </w:p>
+    <w:p>
+      <w:pPr>
+        <w:numPr>
+          <w:ilvl w:val="0"/>
+          <w:numId w:val="1001"/>
+        </w:numPr>
+        <w:pStyle w:val="Compact"/>
+      </w:pPr>
+      <w:r>
+        <w:t xml:space="preserve">Familiarized with Strawberry Fields (SF) software</w:t>
       </w:r>
       <w:r>
         <w:br/>
       </w:r>
-      <w:r>
-        <w:t xml:space="preserve">- Analyse the effect of channel imperfections on the communication performance</w:t>
+    </w:p>
+    <w:p>
+      <w:pPr>
+        <w:numPr>
+          <w:ilvl w:val="0"/>
+          <w:numId w:val="1001"/>
+        </w:numPr>
+        <w:pStyle w:val="Compact"/>
+      </w:pPr>
+      <w:r>
+        <w:t xml:space="preserve">Prepared helper functions for state visualisation and measurement in SF</w:t>
       </w:r>
       <w:r>
         <w:br/>
       </w:r>
-      <w:r>
-        <w:t xml:space="preserve">- Study Helstrom bound and compare with homodyne-based detection</w:t>
-      </w:r>
-    </w:p>
-    <w:p>
-      <w:pPr>
-        <w:pStyle w:val="BodyText"/>
-      </w:pPr>
-      <w:r>
-        <w:rPr>
-          <w:bCs/>
-          <w:b/>
-        </w:rPr>
-        <w:t xml:space="preserve">Computational Objectives</w:t>
-      </w:r>
-      <w:r>
-        <w:t xml:space="preserve"> </w:t>
-      </w:r>
-      <w:r>
-        <w:t xml:space="preserve">- Become proficient in the Strawberry Fields quantum photonic simulation framework</w:t>
+    </w:p>
+    <w:p>
+      <w:pPr>
+        <w:numPr>
+          <w:ilvl w:val="0"/>
+          <w:numId w:val="1001"/>
+        </w:numPr>
+        <w:pStyle w:val="Compact"/>
+      </w:pPr>
+      <w:r>
+        <w:t xml:space="preserve">Prepared protocols for coherent states and displaced-squeezed states in noise-free channel</w:t>
       </w:r>
       <w:r>
         <w:br/>
       </w:r>
-      <w:r>
-        <w:t xml:space="preserve">- Simulate Gaussian states in various channels and perform homodyne detection</w:t>
-      </w:r>
-      <w:r>
-        <w:br/>
-      </w:r>
-      <w:r>
-        <w:t xml:space="preserve">- Investigate the influence of key system parameters (e.g. squeezing) on performance</w:t>
-      </w:r>
-      <w:r>
-        <w:br/>
-      </w:r>
-      <w:r>
-        <w:t xml:space="preserve">- Validate the simulated results against the theoretical predictions of the paper</w:t>
+    </w:p>
+    <w:p>
+      <w:pPr>
+        <w:numPr>
+          <w:ilvl w:val="0"/>
+          <w:numId w:val="1001"/>
+        </w:numPr>
+        <w:pStyle w:val="Compact"/>
+      </w:pPr>
+      <w:r>
+        <w:t xml:space="preserve">Visualised the error probability for the aforementioned protocols and compared to theoretical function</w:t>
       </w:r>
     </w:p>
     <w:p>
@@ -275,106 +173,13 @@
       </w:r>
     </w:p>
     <w:bookmarkEnd w:id="23"/>
-    <w:bookmarkStart w:id="24" w:name="plan-to-achieve-the-objectives"/>
-    <w:p>
-      <w:pPr>
-        <w:pStyle w:val="Heading3"/>
-      </w:pPr>
-      <w:r>
-        <w:t xml:space="preserve">Plan to Achieve the Objectives</w:t>
-      </w:r>
-    </w:p>
-    <w:p>
-      <w:pPr>
-        <w:pStyle w:val="FirstParagraph"/>
-      </w:pPr>
-      <w:r>
-        <w:t xml:space="preserve">The theoretical and computational objectives will be developed in parallel so that the understanding of the underlying physics continuously informs the implementation, while simulation results provide numerical validation of the theoretical predictions.</w:t>
-      </w:r>
-    </w:p>
-    <w:p>
-      <w:pPr>
-        <w:numPr>
-          <w:ilvl w:val="0"/>
-          <w:numId w:val="1002"/>
-        </w:numPr>
-      </w:pPr>
-      <w:r>
-        <w:t xml:space="preserve">Familiarization with Strawberry Fields</w:t>
-      </w:r>
-      <w:r>
-        <w:br/>
-      </w:r>
-      <w:r>
-        <w:t xml:space="preserve">Develop an intuitive understanding on how the Strawberry Fields framework works by studying its capabilities (e.g. state and channel preparation, measurement operations).</w:t>
-      </w:r>
-    </w:p>
-    <w:p>
-      <w:pPr>
-        <w:numPr>
-          <w:ilvl w:val="0"/>
-          <w:numId w:val="1002"/>
-        </w:numPr>
-      </w:pPr>
-      <w:r>
-        <w:t xml:space="preserve">Development and Validation of Core Simulation Components</w:t>
-      </w:r>
-      <w:r>
-        <w:br/>
-      </w:r>
-      <w:r>
-        <w:t xml:space="preserve">Implement a collection of helper functions performing specific tasks and validate them independently against theoretical results before integrating it into the complete protocol.</w:t>
-      </w:r>
-    </w:p>
-    <w:p>
-      <w:pPr>
-        <w:numPr>
-          <w:ilvl w:val="0"/>
-          <w:numId w:val="1002"/>
-        </w:numPr>
-      </w:pPr>
-      <w:r>
-        <w:t xml:space="preserve">Progressive Construction of the Communication Model</w:t>
-      </w:r>
-      <w:r>
-        <w:br/>
-      </w:r>
-      <w:r>
-        <w:t xml:space="preserve">Combine the validated components to build a variety of communication scenarios. This approach facilitates debugging, validation, and future extensions of the simulation.</w:t>
-      </w:r>
-    </w:p>
-    <w:p>
-      <w:pPr>
-        <w:numPr>
-          <w:ilvl w:val="0"/>
-          <w:numId w:val="1002"/>
-        </w:numPr>
-      </w:pPr>
-      <w:r>
-        <w:t xml:space="preserve">Performance Evaluation and Comparison</w:t>
-      </w:r>
-      <w:r>
-        <w:br/>
-      </w:r>
-      <w:r>
-        <w:t xml:space="preserve">Compare error probabilities with the Helstrom bound to assess the potential advantages of squeezing-enhanced communication under different conditions.</w:t>
-      </w:r>
-    </w:p>
-    <w:p>
-      <w:pPr>
-        <w:numPr>
-          <w:ilvl w:val="0"/>
-          <w:numId w:val="1002"/>
-        </w:numPr>
-      </w:pPr>
-      <w:r>
-        <w:t xml:space="preserve">Theoretical Analysis and Verification</w:t>
-      </w:r>
-      <w:r>
-        <w:br/>
-      </w:r>
-      <w:r>
-        <w:t xml:space="preserve">Derive the analytical expressions relevant to the project and compare simulated results with the analytical predictions of the reference paper.</w:t>
+    <w:bookmarkStart w:id="26" w:name="progress"/>
+    <w:p>
+      <w:pPr>
+        <w:pStyle w:val="Heading2"/>
+      </w:pPr>
+      <w:r>
+        <w:t xml:space="preserve">Progress</w:t>
       </w:r>
     </w:p>
     <w:p>
@@ -384,8 +189,7 @@
         </w:pict>
       </w:r>
     </w:p>
-    <w:bookmarkEnd w:id="24"/>
-    <w:bookmarkStart w:id="25" w:name="Xeaf8f965c2875702ad33a77796308e2f862840d"/>
+    <w:bookmarkStart w:id="24" w:name="Xeaf8f965c2875702ad33a77796308e2f862840d"/>
     <w:p>
       <w:pPr>
         <w:pStyle w:val="Heading3"/>
@@ -437,14 +241,14 @@
         </w:pict>
       </w:r>
     </w:p>
-    <w:bookmarkEnd w:id="25"/>
-    <w:bookmarkStart w:id="26" w:name="X673e1914546ef077eeaa8e60a912210bac6e183"/>
+    <w:bookmarkEnd w:id="24"/>
+    <w:bookmarkStart w:id="25" w:name="X74cbd486fb95135b6e77d0c5989bc6e774ae703"/>
     <w:p>
       <w:pPr>
         <w:pStyle w:val="Heading3"/>
       </w:pPr>
       <w:r>
-        <w:t xml:space="preserve">Prepare protocols for coherent functions and displaced squeezed functions in noise-free channel</w:t>
+        <w:t xml:space="preserve">Prepare protocols for coherent states and displaced-squeezed states in noise-free channel</w:t>
       </w:r>
     </w:p>
     <w:p>
@@ -543,7 +347,7 @@
         <w:pStyle w:val="BodyText"/>
       </w:pPr>
       <w:r>
-        <w:t xml:space="preserve">The same protocol is then extended to displaced squeezed states. In this case, the total energy is kept fixed while a fraction of the energy is allocated to squeezing. The error probability is studied as a function of the total photon number,</w:t>
+        <w:t xml:space="preserve">The same protocol is then extended to displaced-squeezed states. In this case, the total energy is kept fixed while a fraction of the energy is allocated to squeezing. The error probability is studied as a function of the total photon number,</w:t>
       </w:r>
     </w:p>
     <w:p>
@@ -746,9 +550,9 @@
         </m:oMath>
       </m:oMathPara>
     </w:p>
+    <w:bookmarkEnd w:id="25"/>
     <w:bookmarkEnd w:id="26"/>
     <w:bookmarkEnd w:id="27"/>
-    <w:bookmarkEnd w:id="28"/>
     <w:sectPr/>
   </w:body>
 </w:document>
@@ -935,9 +739,6 @@
     <w:abstractNumId w:val="990"/>
   </w:num>
   <w:num w:numId="1001">
-    <w:abstractNumId w:val="991"/>
-  </w:num>
-  <w:num w:numId="1002">
     <w:abstractNumId w:val="991"/>
   </w:num>
 </w:numbering>

</xml_diff>

<commit_message>
tried to overcome rendering issues
</commit_message>
<xml_diff>
--- a/journal/journal.docx
+++ b/journal/journal.docx
@@ -2374,75 +2374,91 @@
         <w:pStyle w:val="FirstParagraph"/>
       </w:pPr>
       <w:r>
-        <w:t xml:space="preserve">The next protocol that needs to be investigated is discrimination in the presence of phase noise. To implement this protocol, the theoretical framework of the paper was first studied (Eqs. 18-22). In this protocol the state becomes a statistical mixture of phase rotated CS or DSS. In particular, the state of the noise-free protocol is</w:t>
-      </w:r>
-      <w:r>
-        <w:t xml:space="preserve"> </w:t>
-      </w:r>
-      <m:oMath>
-        <m:r>
-          <m:rPr>
-            <m:sty m:val="p"/>
-          </m:rPr>
-          <m:t>|</m:t>
-        </m:r>
-        <m:r>
-          <m:rPr>
-            <m:sty m:val="p"/>
-          </m:rPr>
-          <m:t>±</m:t>
-        </m:r>
-        <m:r>
-          <m:t>a</m:t>
-        </m:r>
-        <m:r>
-          <m:rPr>
-            <m:sty m:val="p"/>
-          </m:rPr>
-          <m:t>,</m:t>
-        </m:r>
-        <m:r>
-          <m:t>r</m:t>
-        </m:r>
-        <m:r>
-          <m:rPr>
-            <m:sty m:val="p"/>
-          </m:rPr>
-          <m:t>⟩</m:t>
-        </m:r>
-        <m:r>
-          <m:rPr>
-            <m:sty m:val="p"/>
-          </m:rPr>
-          <m:t>⟩</m:t>
-        </m:r>
-      </m:oMath>
-      <w:r>
-        <w:t xml:space="preserve"> </w:t>
-      </w:r>
-      <w:r>
-        <w:t xml:space="preserve">becomes $U_{</w:t>
-      </w:r>
-      <w:r>
-        <w:t xml:space="preserve">} |</w:t>
-      </w:r>
-      <w:r>
-        <w:t xml:space="preserve">a, r</w:t>
-      </w:r>
-      <w:r>
-        <w:t xml:space="preserve">= |</w:t>
-      </w:r>
-      <w:r>
-        <w:t xml:space="preserve">a e^{-i</w:t>
-      </w:r>
-      <w:r>
-        <w:t xml:space="preserve">}, r e^{-i2</w:t>
-      </w:r>
-      <w:r>
-        <w:t xml:space="preserve">}</w:t>
-      </w:r>
-      <w:r>
-        <w:t xml:space="preserve">$, where the phase</w:t>
+        <w:t xml:space="preserve">The next protocol that needs to be investigated is discrimination in the presence of phase noise. To implement this protocol, the theoretical framework of the paper was first studied (Eqs. 18-22). In this protocol the state becomes a statistical mixture of phase rotated CS or DSS. In particular, the state of the noise-free protocol is |±a, r⟩ becomes</w:t>
+      </w:r>
+      <w:r>
+        <w:t xml:space="preserve"> </w:t>
+      </w:r>
+      <m:oMath>
+        <m:sSub>
+          <m:e>
+            <m:r>
+              <m:t>U</m:t>
+            </m:r>
+          </m:e>
+          <m:sub>
+            <m:r>
+              <m:t>ϕ</m:t>
+            </m:r>
+          </m:sub>
+        </m:sSub>
+      </m:oMath>
+      <w:r>
+        <w:t xml:space="preserve"> </w:t>
+      </w:r>
+      <w:r>
+        <w:t xml:space="preserve">|±a, r⟩ = |±a</w:t>
+      </w:r>
+      <w:r>
+        <w:t xml:space="preserve"> </w:t>
+      </w:r>
+      <m:oMath>
+        <m:sSup>
+          <m:e>
+            <m:r>
+              <m:t>e</m:t>
+            </m:r>
+          </m:e>
+          <m:sup>
+            <m:r>
+              <m:rPr>
+                <m:sty m:val="p"/>
+              </m:rPr>
+              <m:t>−</m:t>
+            </m:r>
+            <m:r>
+              <m:t>i</m:t>
+            </m:r>
+            <m:r>
+              <m:t>ϕ</m:t>
+            </m:r>
+          </m:sup>
+        </m:sSup>
+      </m:oMath>
+      <w:r>
+        <w:t xml:space="preserve">, r</w:t>
+      </w:r>
+      <w:r>
+        <w:t xml:space="preserve"> </w:t>
+      </w:r>
+      <m:oMath>
+        <m:sSup>
+          <m:e>
+            <m:r>
+              <m:t>e</m:t>
+            </m:r>
+          </m:e>
+          <m:sup>
+            <m:r>
+              <m:rPr>
+                <m:sty m:val="p"/>
+              </m:rPr>
+              <m:t>−</m:t>
+            </m:r>
+            <m:r>
+              <m:t>i</m:t>
+            </m:r>
+            <m:r>
+              <m:t>2</m:t>
+            </m:r>
+            <m:r>
+              <m:t>ϕ</m:t>
+            </m:r>
+          </m:sup>
+        </m:sSup>
+      </m:oMath>
+      <w:r>
+        <w:t xml:space="preserve">⟩, where the phase</w:t>
       </w:r>
       <w:r>
         <w:t xml:space="preserve"> </w:t>

</xml_diff>